<commit_message>
Add GSC export check to the AEO audit, drop SearchAction from facts.json
Every URL in the supplied Coverage drilldowns was requested live. All 12
reported 5xx URLs now resolve, 27 redirects take two hops, and Google has
already declined 19 city and 23 glossary pages. Most clicks in the
Performance export come from branded or scripted queries, so the homepage
share and desktop CTR figures in the draft top 100 list are not usable.

facts.json still declared a SearchAction for the sitelinks search box,
which Google retired in October 2024. GSC crawled one of these template
URLs and reported it as a 5xx.

Co-Authored-By: Claude Opus 5.5 <noreply@anthropic.com>
Claude-Session: https://claude.ai/code/session_016BFACVnepcXMqjYLucgmrG
</commit_message>
<xml_diff>
--- a/audits/juicy-designs-aeo-audit-summary.docx
+++ b/audits/juicy-designs-aeo-audit-summary.docx
@@ -443,7 +443,7 @@
         <w:spacing w:after="120"/>
       </w:pPr>
       <w:r>
-        <w:t xml:space="preserve">Health score 24/100 (F). GEO score 54/100 (poor). Impressions have recovered to about 72% of the July peak, but average position has slipped every week since 28 September (15.7 to 23.3).</w:t>
+        <w:t xml:space="preserve">Health score 23/100 (F). GEO score 54/100 (poor). Impressions have recovered to about 72% of the July peak, but average position has slipped every week since 28 September (15.7 to 23.3).</w:t>
       </w:r>
     </w:p>
     <w:p>
@@ -460,7 +460,7 @@
         <w:spacing w:after="120"/>
       </w:pPr>
       <w:r>
-        <w:t xml:space="preserve">juicy-designs-aeo-audit.docx - measurement snapshot, AI visibility sweep and citability scores, 23-point scorecard (17 of 22 passed), 6 red flags, 9 yellow flags and a 16-item roadmap.</w:t>
+        <w:t xml:space="preserve">juicy-designs-aeo-audit.docx - measurement snapshot, AI visibility sweep and citability scores, 23-point scorecard (17 of 22 passed), 6 red flags, 10 yellow flags, a check of the supplied GSC exports and draft top 100 list, and an 18-item roadmap.</w:t>
       </w:r>
     </w:p>
     <w:sectPr>

</xml_diff>